<commit_message>
fix ke thuoc va cap nhat trang thai dich vu CLS qua API moi
</commit_message>
<xml_diff>
--- a/DanhMucICD.docx
+++ b/DanhMucICD.docx
@@ -223,7 +223,23 @@
           <w:b/>
           <w:sz w:val="26"/>
         </w:rPr>
-        <w:t>2.1. Hàm lấy danh sách bệnh lý apiGetICDList (Dòng 238 - 247)</w:t>
+        <w:t xml:space="preserve">2.1. Hàm lấy danh sách bệnh lý apiGetICDList (Dòng </w:t>
+      </w:r>
+      <w:r>
+        <w:rPr>
+          <w:rFonts w:ascii="Times New Roman" w:hAnsi="Times New Roman" w:cs="Times New Roman"/>
+          <w:b/>
+          <w:sz w:val="26"/>
+        </w:rPr>
+        <w:t>280 - 288</w:t>
+      </w:r>
+      <w:r>
+        <w:rPr>
+          <w:rFonts w:ascii="Times New Roman" w:hAnsi="Times New Roman" w:cs="Times New Roman"/>
+          <w:b/>
+          <w:sz w:val="26"/>
+        </w:rPr>
+        <w:t>)</w:t>
       </w:r>
     </w:p>
     <w:p>
@@ -304,6 +320,7 @@
           <w:rFonts w:ascii="Courier New" w:hAnsi="Courier New" w:cs="Courier New"/>
           <w:sz w:val="20"/>
         </w:rPr>
+        <w:lastRenderedPageBreak/>
         <w:t xml:space="preserve">  if (tenBenh) queryParams.append('tenBenh', tenBenh);</w:t>
       </w:r>
     </w:p>
@@ -412,7 +429,23 @@
           <w:b/>
           <w:sz w:val="26"/>
         </w:rPr>
-        <w:t>2.2. Hàm thêm mới bệnh lý apiAddICD (Dòng 249 - 255)</w:t>
+        <w:t xml:space="preserve">2.2. Hàm thêm mới bệnh lý apiAddICD (Dòng </w:t>
+      </w:r>
+      <w:r>
+        <w:rPr>
+          <w:rFonts w:ascii="Times New Roman" w:hAnsi="Times New Roman" w:cs="Times New Roman"/>
+          <w:b/>
+          <w:sz w:val="26"/>
+        </w:rPr>
+        <w:t>291 - 296</w:t>
+      </w:r>
+      <w:r>
+        <w:rPr>
+          <w:rFonts w:ascii="Times New Roman" w:hAnsi="Times New Roman" w:cs="Times New Roman"/>
+          <w:b/>
+          <w:sz w:val="26"/>
+        </w:rPr>
+        <w:t>)</w:t>
       </w:r>
     </w:p>
     <w:p>
@@ -560,7 +593,23 @@
           <w:b/>
           <w:sz w:val="26"/>
         </w:rPr>
-        <w:t>2.3. Hàm cập nhật thông tin bệnh lý apiUpdateICD (Dòng 257 - 263)</w:t>
+        <w:t xml:space="preserve">2.3. Hàm cập nhật thông tin bệnh lý apiUpdateICD (Dòng </w:t>
+      </w:r>
+      <w:r>
+        <w:rPr>
+          <w:rFonts w:ascii="Times New Roman" w:hAnsi="Times New Roman" w:cs="Times New Roman"/>
+          <w:b/>
+          <w:sz w:val="26"/>
+        </w:rPr>
+        <w:t>299 - 304</w:t>
+      </w:r>
+      <w:r>
+        <w:rPr>
+          <w:rFonts w:ascii="Times New Roman" w:hAnsi="Times New Roman" w:cs="Times New Roman"/>
+          <w:b/>
+          <w:sz w:val="26"/>
+        </w:rPr>
+        <w:t>)</w:t>
       </w:r>
     </w:p>
     <w:p>
@@ -708,7 +757,23 @@
           <w:b/>
           <w:sz w:val="26"/>
         </w:rPr>
-        <w:t>2.4. Hàm xóa bệnh lý apiDeleteICD (Dòng 265 - 270)</w:t>
+        <w:t xml:space="preserve">2.4. Hàm xóa bệnh lý apiDeleteICD (Dòng </w:t>
+      </w:r>
+      <w:r>
+        <w:rPr>
+          <w:rFonts w:ascii="Times New Roman" w:hAnsi="Times New Roman" w:cs="Times New Roman"/>
+          <w:b/>
+          <w:sz w:val="26"/>
+        </w:rPr>
+        <w:t>307 - 311</w:t>
+      </w:r>
+      <w:r>
+        <w:rPr>
+          <w:rFonts w:ascii="Times New Roman" w:hAnsi="Times New Roman" w:cs="Times New Roman"/>
+          <w:b/>
+          <w:sz w:val="26"/>
+        </w:rPr>
+        <w:t>)</w:t>
       </w:r>
     </w:p>
     <w:p>
@@ -858,7 +923,23 @@
           <w:b/>
           <w:sz w:val="26"/>
         </w:rPr>
-        <w:t>3.1. Hàm tải danh mục loadICDList (Dòng 33 - 59)</w:t>
+        <w:t xml:space="preserve">3.1. Hàm tải danh mục loadICDList (Dòng </w:t>
+      </w:r>
+      <w:r>
+        <w:rPr>
+          <w:rFonts w:ascii="Times New Roman" w:hAnsi="Times New Roman" w:cs="Times New Roman"/>
+          <w:b/>
+          <w:sz w:val="26"/>
+        </w:rPr>
+        <w:t>31 - 55</w:t>
+      </w:r>
+      <w:r>
+        <w:rPr>
+          <w:rFonts w:ascii="Times New Roman" w:hAnsi="Times New Roman" w:cs="Times New Roman"/>
+          <w:b/>
+          <w:sz w:val="26"/>
+        </w:rPr>
+        <w:t>)</w:t>
       </w:r>
     </w:p>
     <w:p>
@@ -1342,7 +1423,23 @@
           <w:b/>
           <w:sz w:val="26"/>
         </w:rPr>
-        <w:t>3.2. Cơ chế Debounce thời gian thực (Dòng 62 - 68)</w:t>
+        <w:t xml:space="preserve">3.2. Cơ chế Debounce thời gian thực (Dòng </w:t>
+      </w:r>
+      <w:r>
+        <w:rPr>
+          <w:rFonts w:ascii="Times New Roman" w:hAnsi="Times New Roman" w:cs="Times New Roman"/>
+          <w:b/>
+          <w:sz w:val="26"/>
+        </w:rPr>
+        <w:t>62 - 65</w:t>
+      </w:r>
+      <w:r>
+        <w:rPr>
+          <w:rFonts w:ascii="Times New Roman" w:hAnsi="Times New Roman" w:cs="Times New Roman"/>
+          <w:b/>
+          <w:sz w:val="26"/>
+        </w:rPr>
+        <w:t>)</w:t>
       </w:r>
     </w:p>
     <w:p>
@@ -1499,7 +1596,23 @@
           <w:b/>
           <w:sz w:val="26"/>
         </w:rPr>
-        <w:t>3.3. Hàm lưu dữ liệu bệnh lý handleSaveIcd (Dòng 100 - 132)</w:t>
+        <w:t xml:space="preserve">3.3. Hàm lưu dữ liệu bệnh lý handleSaveIcd (Dòng </w:t>
+      </w:r>
+      <w:r>
+        <w:rPr>
+          <w:rFonts w:ascii="Times New Roman" w:hAnsi="Times New Roman" w:cs="Times New Roman"/>
+          <w:b/>
+          <w:sz w:val="26"/>
+        </w:rPr>
+        <w:t>135 - 167</w:t>
+      </w:r>
+      <w:r>
+        <w:rPr>
+          <w:rFonts w:ascii="Times New Roman" w:hAnsi="Times New Roman" w:cs="Times New Roman"/>
+          <w:b/>
+          <w:sz w:val="26"/>
+        </w:rPr>
+        <w:t>)</w:t>
       </w:r>
     </w:p>
     <w:p>
@@ -2065,7 +2178,23 @@
           <w:b/>
           <w:sz w:val="26"/>
         </w:rPr>
-        <w:t>3.4. Hàm xóa bệnh lý handleDeleteIcd (Dòng 135 - 149)</w:t>
+        <w:t xml:space="preserve">3.4. Hàm xóa bệnh lý handleDeleteIcd (Dòng </w:t>
+      </w:r>
+      <w:r>
+        <w:rPr>
+          <w:rFonts w:ascii="Times New Roman" w:hAnsi="Times New Roman" w:cs="Times New Roman"/>
+          <w:b/>
+          <w:sz w:val="26"/>
+        </w:rPr>
+        <w:t>170 - 184</w:t>
+      </w:r>
+      <w:r>
+        <w:rPr>
+          <w:rFonts w:ascii="Times New Roman" w:hAnsi="Times New Roman" w:cs="Times New Roman"/>
+          <w:b/>
+          <w:sz w:val="26"/>
+        </w:rPr>
+        <w:t>)</w:t>
       </w:r>
     </w:p>
     <w:p>

</xml_diff>